<commit_message>
Recolour CQC docs to template palette and add generic HLD/LLD templates
Apply the HLD_Template.docx brand palette (5F2861 purple, F0F0F0/F2EEF2
shading, 404040/646464 greys, 0563C1 hyperlink; heading purple 7030A0 and
code-syntax colours preserved) to HLD_CQC, LLD_CQC and the Azure HLD/LLD
CQC templates. Gold note callouts kept.

Add CQC_HLD_Template.docx and CQC_LLD_Template.docx: generic (de-Azure'd)
versions of the Azure CQC templates with Azure removed from titles,
running headers, section headings and intro/framing prose. Service tables
and technical content retained as illustrative Azure examples.

Co-Authored-By: Claude Opus 4.8 (1M context) <noreply@anthropic.com>
</commit_message>
<xml_diff>
--- a/HLD_CQC.docx
+++ b/HLD_CQC.docx
@@ -53,10 +53,10 @@
     <w:p>
       <w:pPr>
         <w:pBdr>
-          <w:top w:val="single" w:sz="24" w:space="6" w:color="7030A0"/>
-          <w:bottom w:val="single" w:sz="24" w:space="6" w:color="7030A0"/>
+          <w:top w:val="single" w:sz="24" w:space="6" w:color="5F2861"/>
+          <w:bottom w:val="single" w:sz="24" w:space="6" w:color="5F2861"/>
         </w:pBdr>
-        <w:shd w:val="clear" w:color="auto" w:fill="4C1D6B"/>
+        <w:shd w:val="clear" w:color="auto" w:fill="5F2861"/>
         <w:spacing w:before="240" w:after="240"/>
         <w:jc w:val="center"/>
       </w:pPr>
@@ -3541,21 +3541,21 @@
   <w:p>
     <w:pPr>
       <w:pBdr>
-        <w:top w:val="single" w:sz="6" w:space="1" w:color="7030A0"/>
+        <w:top w:val="single" w:sz="6" w:space="1" w:color="5F2861"/>
       </w:pBdr>
       <w:tabs>
         <w:tab w:val="right" w:pos="9026"/>
       </w:tabs>
       <w:rPr>
         <w:rFonts w:ascii="Calibri" w:hAnsi="Calibri" w:cs="Calibri"/>
-        <w:color w:val="888888"/>
+        <w:color w:val="646464"/>
         <w:sz w:val="16"/>
       </w:rPr>
     </w:pPr>
     <w:r>
       <w:rPr>
         <w:rFonts w:ascii="Calibri" w:hAnsi="Calibri" w:cs="Calibri"/>
-        <w:color w:val="888888"/>
+        <w:color w:val="646464"/>
         <w:sz w:val="16"/>
       </w:rPr>
       <w:t>CQC Client File Transfer — High-Level Design — HLD v1.0</w:t>
@@ -3563,7 +3563,7 @@
     <w:r>
       <w:rPr>
         <w:rFonts w:ascii="Calibri" w:hAnsi="Calibri" w:cs="Calibri"/>
-        <w:color w:val="888888"/>
+        <w:color w:val="646464"/>
         <w:sz w:val="16"/>
       </w:rPr>
       <w:tab/>
@@ -3572,7 +3572,7 @@
     <w:r>
       <w:rPr>
         <w:rFonts w:ascii="Calibri" w:hAnsi="Calibri" w:cs="Calibri"/>
-        <w:color w:val="888888"/>
+        <w:color w:val="646464"/>
         <w:sz w:val="16"/>
       </w:rPr>
       <w:fldChar w:fldCharType="begin"/>
@@ -3580,7 +3580,7 @@
     <w:r>
       <w:rPr>
         <w:rFonts w:ascii="Calibri" w:hAnsi="Calibri" w:cs="Calibri"/>
-        <w:color w:val="888888"/>
+        <w:color w:val="646464"/>
         <w:sz w:val="16"/>
       </w:rPr>
       <w:instrText>PAGE</w:instrText>
@@ -3588,7 +3588,7 @@
     <w:r>
       <w:rPr>
         <w:rFonts w:ascii="Calibri" w:hAnsi="Calibri" w:cs="Calibri"/>
-        <w:color w:val="888888"/>
+        <w:color w:val="646464"/>
         <w:sz w:val="16"/>
       </w:rPr>
       <w:fldChar w:fldCharType="separate"/>
@@ -3597,7 +3597,7 @@
       <w:rPr>
         <w:rFonts w:ascii="Calibri" w:hAnsi="Calibri" w:cs="Calibri"/>
         <w:noProof/>
-        <w:color w:val="888888"/>
+        <w:color w:val="646464"/>
         <w:sz w:val="16"/>
       </w:rPr>
       <w:t>1</w:t>
@@ -3605,7 +3605,7 @@
     <w:r>
       <w:rPr>
         <w:rFonts w:ascii="Calibri" w:hAnsi="Calibri" w:cs="Calibri"/>
-        <w:color w:val="888888"/>
+        <w:color w:val="646464"/>
         <w:sz w:val="16"/>
       </w:rPr>
       <w:fldChar w:fldCharType="end"/>
@@ -3644,7 +3644,7 @@
   <w:p>
     <w:pPr>
       <w:pBdr>
-        <w:bottom w:val="single" w:sz="6" w:space="1" w:color="7030A0"/>
+        <w:bottom w:val="single" w:sz="6" w:space="1" w:color="5F2861"/>
       </w:pBdr>
       <w:tabs>
         <w:tab w:val="right" w:pos="6900"/>
@@ -3713,7 +3713,7 @@
     <w:r>
       <w:rPr>
         <w:rFonts w:ascii="Calibri" w:hAnsi="Calibri" w:cs="Calibri"/>
-        <w:color w:val="888888"/>
+        <w:color w:val="646464"/>
         <w:sz w:val="16"/>
       </w:rPr>
       <w:tab/>
@@ -4317,7 +4317,7 @@
       <w:keepNext/>
       <w:keepLines/>
       <w:pBdr>
-        <w:bottom w:val="single" w:sz="6" w:space="4" w:color="7030A0"/>
+        <w:bottom w:val="single" w:sz="6" w:space="4" w:color="5F2861"/>
       </w:pBdr>
       <w:spacing w:before="360" w:after="160"/>
       <w:outlineLvl w:val="0"/>
@@ -4439,7 +4439,7 @@
       <w:rFonts w:eastAsiaTheme="majorEastAsia" w:cstheme="majorBidi"/>
       <w:i/>
       <w:iCs/>
-      <w:color w:val="595959" w:themeColor="text1" w:themeTint="A6"/>
+      <w:color w:val="404040" w:themeColor="text1" w:themeTint="A6"/>
     </w:rPr>
   </w:style>
   <w:style w:type="paragraph" w:styleId="Heading7">
@@ -4460,7 +4460,7 @@
     </w:pPr>
     <w:rPr>
       <w:rFonts w:eastAsiaTheme="majorEastAsia" w:cstheme="majorBidi"/>
-      <w:color w:val="595959" w:themeColor="text1" w:themeTint="A6"/>
+      <w:color w:val="404040" w:themeColor="text1" w:themeTint="A6"/>
     </w:rPr>
   </w:style>
   <w:style w:type="paragraph" w:styleId="Heading8">
@@ -4483,7 +4483,7 @@
       <w:rFonts w:eastAsiaTheme="majorEastAsia" w:cstheme="majorBidi"/>
       <w:i/>
       <w:iCs/>
-      <w:color w:val="272727" w:themeColor="text1" w:themeTint="D8"/>
+      <w:color w:val="404040" w:themeColor="text1" w:themeTint="D8"/>
     </w:rPr>
   </w:style>
   <w:style w:type="paragraph" w:styleId="Heading9">
@@ -4504,7 +4504,7 @@
     </w:pPr>
     <w:rPr>
       <w:rFonts w:eastAsiaTheme="majorEastAsia" w:cstheme="majorBidi"/>
-      <w:color w:val="272727" w:themeColor="text1" w:themeTint="D8"/>
+      <w:color w:val="404040" w:themeColor="text1" w:themeTint="D8"/>
     </w:rPr>
   </w:style>
   <w:style w:type="character" w:default="1" w:styleId="DefaultParagraphFont">
@@ -4614,7 +4614,7 @@
     <w:rsid w:val="00A10FD9"/>
     <w:rPr>
       <w:rFonts w:eastAsiaTheme="majorEastAsia" w:cstheme="majorBidi"/>
-      <w:color w:val="595959" w:themeColor="text1" w:themeTint="A6"/>
+      <w:color w:val="404040" w:themeColor="text1" w:themeTint="A6"/>
       <w:spacing w:val="15"/>
       <w:sz w:val="28"/>
       <w:szCs w:val="28"/>
@@ -4763,7 +4763,7 @@
       <w:rFonts w:eastAsiaTheme="majorEastAsia" w:cstheme="majorBidi"/>
       <w:i/>
       <w:iCs/>
-      <w:color w:val="595959" w:themeColor="text1" w:themeTint="A6"/>
+      <w:color w:val="404040" w:themeColor="text1" w:themeTint="A6"/>
     </w:rPr>
   </w:style>
   <w:style w:type="character" w:customStyle="1" w:styleId="Heading7Char">
@@ -4775,7 +4775,7 @@
     <w:rsid w:val="00A10FD9"/>
     <w:rPr>
       <w:rFonts w:eastAsiaTheme="majorEastAsia" w:cstheme="majorBidi"/>
-      <w:color w:val="595959" w:themeColor="text1" w:themeTint="A6"/>
+      <w:color w:val="404040" w:themeColor="text1" w:themeTint="A6"/>
     </w:rPr>
   </w:style>
   <w:style w:type="character" w:customStyle="1" w:styleId="Heading8Char">
@@ -4789,7 +4789,7 @@
       <w:rFonts w:eastAsiaTheme="majorEastAsia" w:cstheme="majorBidi"/>
       <w:i/>
       <w:iCs/>
-      <w:color w:val="272727" w:themeColor="text1" w:themeTint="D8"/>
+      <w:color w:val="404040" w:themeColor="text1" w:themeTint="D8"/>
     </w:rPr>
   </w:style>
   <w:style w:type="character" w:customStyle="1" w:styleId="Heading9Char">
@@ -4801,7 +4801,7 @@
     <w:rsid w:val="00A10FD9"/>
     <w:rPr>
       <w:rFonts w:eastAsiaTheme="majorEastAsia" w:cstheme="majorBidi"/>
-      <w:color w:val="272727" w:themeColor="text1" w:themeTint="D8"/>
+      <w:color w:val="404040" w:themeColor="text1" w:themeTint="D8"/>
     </w:rPr>
   </w:style>
   <w:style w:type="paragraph" w:styleId="BlockText">
@@ -4864,7 +4864,7 @@
         <w:tcBorders>
           <w:bottom w:val="single" w:sz="4" w:space="0" w:color="FFFFFF"/>
         </w:tcBorders>
-        <w:shd w:val="clear" w:color="auto" w:fill="7030A0"/>
+        <w:shd w:val="clear" w:color="auto" w:fill="5F2861"/>
         <w:vAlign w:val="center"/>
       </w:tcPr>
     </w:tblStylePr>
@@ -4949,7 +4949,7 @@
     <w:basedOn w:val="CaptionChar"/>
     <w:uiPriority w:val="99"/>
     <w:rPr>
-      <w:color w:val="156082" w:themeColor="accent1"/>
+      <w:color w:val="0563C1" w:themeColor="accent1"/>
     </w:rPr>
   </w:style>
   <w:style w:type="paragraph" w:styleId="TOCHeading">

</xml_diff>